<commit_message>
Roadmap: full reimplementation guide (foundations, engine internals, clients, evidence, docs pipeline, 12 documented bugs+fixes, command reference)
</commit_message>
<xml_diff>
--- a/docs/Vector-Code-Walkthrough.docx
+++ b/docs/Vector-Code-Walkthrough.docx
@@ -466,13 +466,14 @@
     </w:p>
     <w:p>
       <w:pPr>
-        <w:spacing w:before="180" w:after="80"/>
+        <w:spacing w:before="260" w:after="120"/>
       </w:pPr>
       <w:r>
         <w:rPr>
           <w:b/>
-          <w:sz w:val="24"/>
-          <w:szCs w:val="24"/>
+          <w:sz w:val="30"/>
+          <w:szCs w:val="30"/>
+          <w:color w:val="1F3864"/>
         </w:rPr>
         <w:t xml:space="preserve">2.1 src/taxonomy.js — the knowledge base (pure data)</w:t>
       </w:r>
@@ -628,13 +629,14 @@
     </w:p>
     <w:p>
       <w:pPr>
-        <w:spacing w:before="180" w:after="80"/>
+        <w:spacing w:before="260" w:after="120"/>
       </w:pPr>
       <w:r>
         <w:rPr>
           <w:b/>
-          <w:sz w:val="24"/>
-          <w:szCs w:val="24"/>
+          <w:sz w:val="30"/>
+          <w:szCs w:val="30"/>
+          <w:color w:val="1F3864"/>
         </w:rPr>
         <w:t xml:space="preserve">2.2 src/analyzer.js — the brain (the pipeline)</w:t>
       </w:r>
@@ -846,13 +848,14 @@
     </w:p>
     <w:p>
       <w:pPr>
-        <w:spacing w:before="180" w:after="80"/>
+        <w:spacing w:before="260" w:after="120"/>
       </w:pPr>
       <w:r>
         <w:rPr>
           <w:b/>
-          <w:sz w:val="24"/>
-          <w:szCs w:val="24"/>
+          <w:sz w:val="30"/>
+          <w:szCs w:val="30"/>
+          <w:color w:val="1F3864"/>
         </w:rPr>
         <w:t xml:space="preserve">2.3 src/semantic.js — word-similarity helper (small, optional)</w:t>
       </w:r>
@@ -948,13 +951,14 @@
     </w:p>
     <w:p>
       <w:pPr>
-        <w:spacing w:before="180" w:after="80"/>
+        <w:spacing w:before="260" w:after="120"/>
       </w:pPr>
       <w:r>
         <w:rPr>
           <w:b/>
-          <w:sz w:val="24"/>
-          <w:szCs w:val="24"/>
+          <w:sz w:val="30"/>
+          <w:szCs w:val="30"/>
+          <w:color w:val="1F3864"/>
         </w:rPr>
         <w:t xml:space="preserve">2.4 src/llm.js — optional AI second opinion</w:t>
       </w:r>
@@ -1026,13 +1030,14 @@
     </w:p>
     <w:p>
       <w:pPr>
-        <w:spacing w:before="180" w:after="80"/>
+        <w:spacing w:before="260" w:after="120"/>
       </w:pPr>
       <w:r>
         <w:rPr>
           <w:b/>
-          <w:sz w:val="24"/>
-          <w:szCs w:val="24"/>
+          <w:sz w:val="30"/>
+          <w:szCs w:val="30"/>
+          <w:color w:val="1F3864"/>
         </w:rPr>
         <w:t xml:space="preserve">2.5 src/tfcheck.js — checks generated Terraform</w:t>
       </w:r>
@@ -1092,13 +1097,14 @@
     </w:p>
     <w:p>
       <w:pPr>
-        <w:spacing w:before="180" w:after="80"/>
+        <w:spacing w:before="260" w:after="120"/>
       </w:pPr>
       <w:r>
         <w:rPr>
           <w:b/>
-          <w:sz w:val="24"/>
-          <w:szCs w:val="24"/>
+          <w:sz w:val="30"/>
+          <w:szCs w:val="30"/>
+          <w:color w:val="1F3864"/>
         </w:rPr>
         <w:t xml:space="preserve">2.6 src/ui.js — draws the report (browser only)</w:t>
       </w:r>
@@ -1146,13 +1152,14 @@
     </w:p>
     <w:p>
       <w:pPr>
-        <w:spacing w:before="180" w:after="80"/>
+        <w:spacing w:before="260" w:after="120"/>
       </w:pPr>
       <w:r>
         <w:rPr>
           <w:b/>
-          <w:sz w:val="24"/>
-          <w:szCs w:val="24"/>
+          <w:sz w:val="30"/>
+          <w:szCs w:val="30"/>
+          <w:color w:val="1F3864"/>
         </w:rPr>
         <w:t xml:space="preserve">2.7 src/settings.js — small shared helpers</w:t>
       </w:r>

</xml_diff>

<commit_message>
Restructure into 3 folders: engine/ (NLP core + evidence + CLI), ui/ (all clients + store + media), docs/ (documents + references + examples); update all scripts and doc paths
</commit_message>
<xml_diff>
--- a/docs/Vector-Code-Walkthrough.docx
+++ b/docs/Vector-Code-Walkthrough.docx
@@ -170,7 +170,7 @@
           <w:szCs w:val="18"/>
           <w:color w:val="333333"/>
         </w:rPr>
-        <w:t xml:space="preserve">     │        src/analyzer.js        │  &lt;- THE BRAIN</w:t>
+        <w:t xml:space="preserve">     │        engine/src/analyzer.js        │  &lt;- THE BRAIN</w:t>
       </w:r>
     </w:p>
     <w:p>
@@ -394,7 +394,7 @@
           <w:szCs w:val="18"/>
           <w:color w:val="333333"/>
         </w:rPr>
-        <w:t xml:space="preserve">  extension/      cli/                  mobile-expo/ + mobile-native/ + web/</w:t>
+        <w:t xml:space="preserve">  ui/extension/      engine/cli/                  ui/mobile-expo/ + ui/mobile-native/ + ui/web/</w:t>
       </w:r>
     </w:p>
     <w:p>
@@ -456,7 +456,7 @@
           <w:szCs w:val="30"/>
           <w:color w:val="1F3864"/>
         </w:rPr>
-        <w:t xml:space="preserve">2. src/ — the engine (read these in this order)</w:t>
+        <w:t xml:space="preserve">2. engine/src/ — the engine (read these in this order)</w:t>
       </w:r>
     </w:p>
     <w:p>
@@ -475,7 +475,7 @@
           <w:szCs w:val="30"/>
           <w:color w:val="1F3864"/>
         </w:rPr>
-        <w:t xml:space="preserve">2.1 src/taxonomy.js — the knowledge base (pure data)</w:t>
+        <w:t xml:space="preserve">2.1 engine/src/taxonomy.js — the knowledge base (pure data)</w:t>
       </w:r>
     </w:p>
     <w:p>
@@ -638,7 +638,7 @@
           <w:szCs w:val="30"/>
           <w:color w:val="1F3864"/>
         </w:rPr>
-        <w:t xml:space="preserve">2.2 src/analyzer.js — the brain (the pipeline)</w:t>
+        <w:t xml:space="preserve">2.2 engine/src/analyzer.js — the brain (the pipeline)</w:t>
       </w:r>
     </w:p>
     <w:p>
@@ -857,7 +857,7 @@
           <w:szCs w:val="30"/>
           <w:color w:val="1F3864"/>
         </w:rPr>
-        <w:t xml:space="preserve">2.3 src/semantic.js — word-similarity helper (small, optional)</w:t>
+        <w:t xml:space="preserve">2.3 engine/src/semantic.js — word-similarity helper (small, optional)</w:t>
       </w:r>
     </w:p>
     <w:p>
@@ -960,7 +960,7 @@
           <w:szCs w:val="30"/>
           <w:color w:val="1F3864"/>
         </w:rPr>
-        <w:t xml:space="preserve">2.4 src/llm.js — optional AI second opinion</w:t>
+        <w:t xml:space="preserve">2.4 engine/src/llm.js — optional AI second opinion</w:t>
       </w:r>
     </w:p>
     <w:p>
@@ -1039,7 +1039,7 @@
           <w:szCs w:val="30"/>
           <w:color w:val="1F3864"/>
         </w:rPr>
-        <w:t xml:space="preserve">2.5 src/tfcheck.js — checks generated Terraform</w:t>
+        <w:t xml:space="preserve">2.5 engine/src/tfcheck.js — checks generated Terraform</w:t>
       </w:r>
     </w:p>
     <w:p>
@@ -1106,7 +1106,7 @@
           <w:szCs w:val="30"/>
           <w:color w:val="1F3864"/>
         </w:rPr>
-        <w:t xml:space="preserve">2.6 src/ui.js — draws the report (browser only)</w:t>
+        <w:t xml:space="preserve">2.6 engine/src/ui.js — draws the report (browser only)</w:t>
       </w:r>
     </w:p>
     <w:p>
@@ -1161,7 +1161,7 @@
           <w:szCs w:val="30"/>
           <w:color w:val="1F3864"/>
         </w:rPr>
-        <w:t xml:space="preserve">2.7 src/settings.js — small shared helpers</w:t>
+        <w:t xml:space="preserve">2.7 engine/src/settings.js — small shared helpers</w:t>
       </w:r>
     </w:p>
     <w:p>
@@ -1223,59 +1223,59 @@
           <w:sz w:val="18"/>
           <w:szCs w:val="18"/>
         </w:rPr>
-        <w:t xml:space="preserve">extension/   |   the browser extension (popup, in-page button, options)   |   load unpacked</w:t>
-      </w:r>
-    </w:p>
-    <w:p>
-      <w:pPr>
-        <w:spacing w:before="0" w:after="0"/>
-      </w:pPr>
-      <w:r>
-        <w:rPr>
-          <w:rFonts w:ascii="Consolas" w:hAnsi="Consolas"/>
-          <w:sz w:val="18"/>
-          <w:szCs w:val="18"/>
-        </w:rPr>
-        <w:t xml:space="preserve">cli/   |   terminal version   |   node cli/vector-cli.js analyze "..."</w:t>
-      </w:r>
-    </w:p>
-    <w:p>
-      <w:pPr>
-        <w:spacing w:before="0" w:after="0"/>
-      </w:pPr>
-      <w:r>
-        <w:rPr>
-          <w:rFonts w:ascii="Consolas" w:hAnsi="Consolas"/>
-          <w:sz w:val="18"/>
-          <w:szCs w:val="18"/>
-        </w:rPr>
-        <w:t xml:space="preserve">mobile-expo/   |   React Native app for iOS + Android   |   npm run start:device</w:t>
-      </w:r>
-    </w:p>
-    <w:p>
-      <w:pPr>
-        <w:spacing w:before="0" w:after="0"/>
-      </w:pPr>
-      <w:r>
-        <w:rPr>
-          <w:rFonts w:ascii="Consolas" w:hAnsi="Consolas"/>
-          <w:sz w:val="18"/>
-          <w:szCs w:val="18"/>
-        </w:rPr>
-        <w:t xml:space="preserve">mobile-native/   |   Capacitor app (Android APK)   |   gradlew assembleDebug</w:t>
-      </w:r>
-    </w:p>
-    <w:p>
-      <w:pPr>
-        <w:spacing w:before="0" w:after="0"/>
-      </w:pPr>
-      <w:r>
-        <w:rPr>
-          <w:rFonts w:ascii="Consolas" w:hAnsi="Consolas"/>
-          <w:sz w:val="18"/>
-          <w:szCs w:val="18"/>
-        </w:rPr>
-        <w:t xml:space="preserve">web/   |   public demo page   |   https://ejajaka.github.io/vector/web/</w:t>
+        <w:t xml:space="preserve">ui/extension/   |   the browser extension (popup, in-page button, options)   |   load unpacked</w:t>
+      </w:r>
+    </w:p>
+    <w:p>
+      <w:pPr>
+        <w:spacing w:before="0" w:after="0"/>
+      </w:pPr>
+      <w:r>
+        <w:rPr>
+          <w:rFonts w:ascii="Consolas" w:hAnsi="Consolas"/>
+          <w:sz w:val="18"/>
+          <w:szCs w:val="18"/>
+        </w:rPr>
+        <w:t xml:space="preserve">engine/cli/   |   terminal version   |   node engine/cli/vector-cli.js analyze "..."</w:t>
+      </w:r>
+    </w:p>
+    <w:p>
+      <w:pPr>
+        <w:spacing w:before="0" w:after="0"/>
+      </w:pPr>
+      <w:r>
+        <w:rPr>
+          <w:rFonts w:ascii="Consolas" w:hAnsi="Consolas"/>
+          <w:sz w:val="18"/>
+          <w:szCs w:val="18"/>
+        </w:rPr>
+        <w:t xml:space="preserve">ui/mobile-expo/   |   React Native app for iOS + Android   |   npm run start:device</w:t>
+      </w:r>
+    </w:p>
+    <w:p>
+      <w:pPr>
+        <w:spacing w:before="0" w:after="0"/>
+      </w:pPr>
+      <w:r>
+        <w:rPr>
+          <w:rFonts w:ascii="Consolas" w:hAnsi="Consolas"/>
+          <w:sz w:val="18"/>
+          <w:szCs w:val="18"/>
+        </w:rPr>
+        <w:t xml:space="preserve">ui/mobile-native/   |   Capacitor app (Android APK)   |   gradlew assembleDebug</w:t>
+      </w:r>
+    </w:p>
+    <w:p>
+      <w:pPr>
+        <w:spacing w:before="0" w:after="0"/>
+      </w:pPr>
+      <w:r>
+        <w:rPr>
+          <w:rFonts w:ascii="Consolas" w:hAnsi="Consolas"/>
+          <w:sz w:val="18"/>
+          <w:szCs w:val="18"/>
+        </w:rPr>
+        <w:t xml:space="preserve">ui/web/   |   public demo page   |   https://ejajaka.github.io/vector/ui/web/</w:t>
       </w:r>
     </w:p>
     <w:p>
@@ -1354,20 +1354,20 @@
           <w:sz w:val="18"/>
           <w:szCs w:val="18"/>
         </w:rPr>
-        <w:t xml:space="preserve">eval/   |   the evidence: labelled prompts, precision/recall harness, κ, downstream study</w:t>
-      </w:r>
-    </w:p>
-    <w:p>
-      <w:pPr>
-        <w:spacing w:before="0" w:after="0"/>
-      </w:pPr>
-      <w:r>
-        <w:rPr>
-          <w:rFonts w:ascii="Consolas" w:hAnsi="Consolas"/>
-          <w:sz w:val="18"/>
-          <w:szCs w:val="18"/>
-        </w:rPr>
-        <w:t xml:space="preserve">test/   |   63 unit tests — run npm test</w:t>
+        <w:t xml:space="preserve">engine/eval/   |   the evidence: labelled prompts, precision/recall harness, κ, downstream study</w:t>
+      </w:r>
+    </w:p>
+    <w:p>
+      <w:pPr>
+        <w:spacing w:before="0" w:after="0"/>
+      </w:pPr>
+      <w:r>
+        <w:rPr>
+          <w:rFonts w:ascii="Consolas" w:hAnsi="Consolas"/>
+          <w:sz w:val="18"/>
+          <w:szCs w:val="18"/>
+        </w:rPr>
+        <w:t xml:space="preserve">engine/test/   |   63 unit tests — run npm test</w:t>
       </w:r>
     </w:p>
     <w:p>
@@ -1406,33 +1406,33 @@
           <w:sz w:val="18"/>
           <w:szCs w:val="18"/>
         </w:rPr>
-        <w:t xml:space="preserve">store/   |   Edge listing text, privacy policy, publishing steps</w:t>
-      </w:r>
-    </w:p>
-    <w:p>
-      <w:pPr>
-        <w:spacing w:before="0" w:after="0"/>
-      </w:pPr>
-      <w:r>
-        <w:rPr>
-          <w:rFonts w:ascii="Consolas" w:hAnsi="Consolas"/>
-          <w:sz w:val="18"/>
-          <w:szCs w:val="18"/>
-        </w:rPr>
-        <w:t xml:space="preserve">references/   |   the papers and articles we cite</w:t>
-      </w:r>
-    </w:p>
-    <w:p>
-      <w:pPr>
-        <w:spacing w:before="0" w:after="0"/>
-      </w:pPr>
-      <w:r>
-        <w:rPr>
-          <w:rFonts w:ascii="Consolas" w:hAnsi="Consolas"/>
-          <w:sz w:val="18"/>
-          <w:szCs w:val="18"/>
-        </w:rPr>
-        <w:t xml:space="preserve">examples/   |   sample organisation policy packs</w:t>
+        <w:t xml:space="preserve">ui/store/   |   Edge listing text, privacy policy, publishing steps</w:t>
+      </w:r>
+    </w:p>
+    <w:p>
+      <w:pPr>
+        <w:spacing w:before="0" w:after="0"/>
+      </w:pPr>
+      <w:r>
+        <w:rPr>
+          <w:rFonts w:ascii="Consolas" w:hAnsi="Consolas"/>
+          <w:sz w:val="18"/>
+          <w:szCs w:val="18"/>
+        </w:rPr>
+        <w:t xml:space="preserve">docs/references/   |   the papers and articles we cite</w:t>
+      </w:r>
+    </w:p>
+    <w:p>
+      <w:pPr>
+        <w:spacing w:before="0" w:after="0"/>
+      </w:pPr>
+      <w:r>
+        <w:rPr>
+          <w:rFonts w:ascii="Consolas" w:hAnsi="Consolas"/>
+          <w:sz w:val="18"/>
+          <w:szCs w:val="18"/>
+        </w:rPr>
+        <w:t xml:space="preserve">docs/examples/   |   sample organisation policy packs</w:t>
       </w:r>
     </w:p>
     <w:p>
@@ -1526,7 +1526,7 @@
           <w:szCs w:val="18"/>
           <w:color w:val="333333"/>
         </w:rPr>
-        <w:t xml:space="preserve">node cli/vector-cli.js analyze "Create an S3 bucket for user documents"</w:t>
+        <w:t xml:space="preserve">node engine/cli/vector-cli.js analyze "Create an S3 bucket for user documents"</w:t>
       </w:r>
     </w:p>
     <w:p>
@@ -1680,7 +1680,7 @@
           <w:sz w:val="22"/>
           <w:szCs w:val="22"/>
         </w:rPr>
-        <w:t xml:space="preserve">• "The evidence is in eval/ — 112 labelled prompts, and 63 unit tests."</w:t>
+        <w:t xml:space="preserve">• "The evidence is in engine/eval/ — 112 labelled prompts, and 63 unit tests."</w:t>
       </w:r>
     </w:p>
     <w:p>
@@ -1730,33 +1730,33 @@
           <w:sz w:val="18"/>
           <w:szCs w:val="18"/>
         </w:rPr>
-        <w:t xml:space="preserve">Which file has the logic?   |   src/analyzer.js</w:t>
-      </w:r>
-    </w:p>
-    <w:p>
-      <w:pPr>
-        <w:spacing w:before="0" w:after="0"/>
-      </w:pPr>
-      <w:r>
-        <w:rPr>
-          <w:rFonts w:ascii="Consolas" w:hAnsi="Consolas"/>
-          <w:sz w:val="18"/>
-          <w:szCs w:val="18"/>
-        </w:rPr>
-        <w:t xml:space="preserve">Where are the rules?   |   src/taxonomy.js (data, not code)</w:t>
-      </w:r>
-    </w:p>
-    <w:p>
-      <w:pPr>
-        <w:spacing w:before="0" w:after="0"/>
-      </w:pPr>
-      <w:r>
-        <w:rPr>
-          <w:rFonts w:ascii="Consolas" w:hAnsi="Consolas"/>
-          <w:sz w:val="18"/>
-          <w:szCs w:val="18"/>
-        </w:rPr>
-        <w:t xml:space="preserve">Where is the ML?   |   There is none. Optional AI is in src/llm.js and is not the core.</w:t>
+        <w:t xml:space="preserve">Which file has the logic?   |   engine/src/analyzer.js</w:t>
+      </w:r>
+    </w:p>
+    <w:p>
+      <w:pPr>
+        <w:spacing w:before="0" w:after="0"/>
+      </w:pPr>
+      <w:r>
+        <w:rPr>
+          <w:rFonts w:ascii="Consolas" w:hAnsi="Consolas"/>
+          <w:sz w:val="18"/>
+          <w:szCs w:val="18"/>
+        </w:rPr>
+        <w:t xml:space="preserve">Where are the rules?   |   engine/src/taxonomy.js (data, not code)</w:t>
+      </w:r>
+    </w:p>
+    <w:p>
+      <w:pPr>
+        <w:spacing w:before="0" w:after="0"/>
+      </w:pPr>
+      <w:r>
+        <w:rPr>
+          <w:rFonts w:ascii="Consolas" w:hAnsi="Consolas"/>
+          <w:sz w:val="18"/>
+          <w:szCs w:val="18"/>
+        </w:rPr>
+        <w:t xml:space="preserve">Where is the ML?   |   There is none. Optional AI is in engine/src/llm.js and is not the core.</w:t>
       </w:r>
     </w:p>
     <w:p>

</xml_diff>

<commit_message>
Docs: bump version refs to v0.7.2; extend version history through 0.6/0.7 (split-pane UI, AI review, Security Delta); regenerate Word docs
</commit_message>
<xml_diff>
--- a/docs/Vector-Code-Walkthrough.docx
+++ b/docs/Vector-Code-Walkthrough.docx
@@ -12,24 +12,24 @@
           <w:sz w:val="40"/>
           <w:szCs w:val="40"/>
         </w:rPr>
-        <w:t xml:space="preserve">Vector — Code Walkthrough (Simple)</w:t>
-      </w:r>
-    </w:p>
-    <w:p>
-      <w:pPr>
-        <w:spacing w:before="0" w:after="60"/>
-      </w:pPr>
-    </w:p>
-    <w:p>
-      <w:pPr>
-        <w:spacing w:before="0" w:after="100"/>
-      </w:pPr>
-      <w:r>
-        <w:rPr>
-          <w:sz w:val="22"/>
-          <w:szCs w:val="22"/>
-        </w:rPr>
-        <w:t xml:space="preserve">How to read this: each file is explained in plain language — what it is,</w:t>
+        <w:t xml:space="preserve">Vector â€” Code Walkthrough (Simple)</w:t>
+      </w:r>
+    </w:p>
+    <w:p>
+      <w:pPr>
+        <w:spacing w:before="0" w:after="60"/>
+      </w:pPr>
+    </w:p>
+    <w:p>
+      <w:pPr>
+        <w:spacing w:before="0" w:after="100"/>
+      </w:pPr>
+      <w:r>
+        <w:rPr>
+          <w:sz w:val="22"/>
+          <w:szCs w:val="22"/>
+        </w:rPr>
+        <w:t xml:space="preserve">How to read this: each file is explained in plain language â€” what it is,</w:t>
       </w:r>
     </w:p>
     <w:p>
@@ -156,91 +156,91 @@
           <w:szCs w:val="18"/>
           <w:color w:val="333333"/>
         </w:rPr>
-        <w:t xml:space="preserve">     ┌───────────────────────────────┐</w:t>
-      </w:r>
-    </w:p>
-    <w:p>
-      <w:pPr>
-        <w:spacing w:before="0" w:after="0"/>
-      </w:pPr>
-      <w:r>
-        <w:rPr>
-          <w:rFonts w:ascii="Consolas" w:hAnsi="Consolas"/>
-          <w:sz w:val="18"/>
-          <w:szCs w:val="18"/>
-          <w:color w:val="333333"/>
-        </w:rPr>
-        <w:t xml:space="preserve">     │        engine/src/analyzer.js        │  &lt;- THE BRAIN</w:t>
-      </w:r>
-    </w:p>
-    <w:p>
-      <w:pPr>
-        <w:spacing w:before="0" w:after="0"/>
-      </w:pPr>
-      <w:r>
-        <w:rPr>
-          <w:rFonts w:ascii="Consolas" w:hAnsi="Consolas"/>
-          <w:sz w:val="18"/>
-          <w:szCs w:val="18"/>
-          <w:color w:val="333333"/>
-        </w:rPr>
-        <w:t xml:space="preserve">     │  reads the prompt, finds the  │</w:t>
-      </w:r>
-    </w:p>
-    <w:p>
-      <w:pPr>
-        <w:spacing w:before="0" w:after="0"/>
-      </w:pPr>
-      <w:r>
-        <w:rPr>
-          <w:rFonts w:ascii="Consolas" w:hAnsi="Consolas"/>
-          <w:sz w:val="18"/>
-          <w:szCs w:val="18"/>
-          <w:color w:val="333333"/>
-        </w:rPr>
-        <w:t xml:space="preserve">     │  missing security controls    │</w:t>
-      </w:r>
-    </w:p>
-    <w:p>
-      <w:pPr>
-        <w:spacing w:before="0" w:after="0"/>
-      </w:pPr>
-      <w:r>
-        <w:rPr>
-          <w:rFonts w:ascii="Consolas" w:hAnsi="Consolas"/>
-          <w:sz w:val="18"/>
-          <w:szCs w:val="18"/>
-          <w:color w:val="333333"/>
-        </w:rPr>
-        <w:t xml:space="preserve">     └───────────────┬───────────────┘</w:t>
-      </w:r>
-    </w:p>
-    <w:p>
-      <w:pPr>
-        <w:spacing w:before="0" w:after="0"/>
-      </w:pPr>
-      <w:r>
-        <w:rPr>
-          <w:rFonts w:ascii="Consolas" w:hAnsi="Consolas"/>
-          <w:sz w:val="18"/>
-          <w:szCs w:val="18"/>
-          <w:color w:val="333333"/>
-        </w:rPr>
-        <w:t xml:space="preserve">                     │ uses</w:t>
-      </w:r>
-    </w:p>
-    <w:p>
-      <w:pPr>
-        <w:spacing w:before="0" w:after="0"/>
-      </w:pPr>
-      <w:r>
-        <w:rPr>
-          <w:rFonts w:ascii="Consolas" w:hAnsi="Consolas"/>
-          <w:sz w:val="18"/>
-          <w:szCs w:val="18"/>
-          <w:color w:val="333333"/>
-        </w:rPr>
-        <w:t xml:space="preserve">        ┌────────────┼────────────┐</w:t>
+        <w:t xml:space="preserve">     â”Œâ”€â”€â”€â”€â”€â”€â”€â”€â”€â”€â”€â”€â”€â”€â”€â”€â”€â”€â”€â”€â”€â”€â”€â”€â”€â”€â”€â”€â”€â”€â”€â”</w:t>
+      </w:r>
+    </w:p>
+    <w:p>
+      <w:pPr>
+        <w:spacing w:before="0" w:after="0"/>
+      </w:pPr>
+      <w:r>
+        <w:rPr>
+          <w:rFonts w:ascii="Consolas" w:hAnsi="Consolas"/>
+          <w:sz w:val="18"/>
+          <w:szCs w:val="18"/>
+          <w:color w:val="333333"/>
+        </w:rPr>
+        <w:t xml:space="preserve">     â”‚        engine/src/analyzer.js        â”‚  &lt;- THE BRAIN</w:t>
+      </w:r>
+    </w:p>
+    <w:p>
+      <w:pPr>
+        <w:spacing w:before="0" w:after="0"/>
+      </w:pPr>
+      <w:r>
+        <w:rPr>
+          <w:rFonts w:ascii="Consolas" w:hAnsi="Consolas"/>
+          <w:sz w:val="18"/>
+          <w:szCs w:val="18"/>
+          <w:color w:val="333333"/>
+        </w:rPr>
+        <w:t xml:space="preserve">     â”‚  reads the prompt, finds the  â”‚</w:t>
+      </w:r>
+    </w:p>
+    <w:p>
+      <w:pPr>
+        <w:spacing w:before="0" w:after="0"/>
+      </w:pPr>
+      <w:r>
+        <w:rPr>
+          <w:rFonts w:ascii="Consolas" w:hAnsi="Consolas"/>
+          <w:sz w:val="18"/>
+          <w:szCs w:val="18"/>
+          <w:color w:val="333333"/>
+        </w:rPr>
+        <w:t xml:space="preserve">     â”‚  missing security controls    â”‚</w:t>
+      </w:r>
+    </w:p>
+    <w:p>
+      <w:pPr>
+        <w:spacing w:before="0" w:after="0"/>
+      </w:pPr>
+      <w:r>
+        <w:rPr>
+          <w:rFonts w:ascii="Consolas" w:hAnsi="Consolas"/>
+          <w:sz w:val="18"/>
+          <w:szCs w:val="18"/>
+          <w:color w:val="333333"/>
+        </w:rPr>
+        <w:t xml:space="preserve">     â””â”€â”€â”€â”€â”€â”€â”€â”€â”€â”€â”€â”€â”€â”€â”€â”¬â”€â”€â”€â”€â”€â”€â”€â”€â”€â”€â”€â”€â”€â”€â”€â”˜</w:t>
+      </w:r>
+    </w:p>
+    <w:p>
+      <w:pPr>
+        <w:spacing w:before="0" w:after="0"/>
+      </w:pPr>
+      <w:r>
+        <w:rPr>
+          <w:rFonts w:ascii="Consolas" w:hAnsi="Consolas"/>
+          <w:sz w:val="18"/>
+          <w:szCs w:val="18"/>
+          <w:color w:val="333333"/>
+        </w:rPr>
+        <w:t xml:space="preserve">                     â”‚ uses</w:t>
+      </w:r>
+    </w:p>
+    <w:p>
+      <w:pPr>
+        <w:spacing w:before="0" w:after="0"/>
+      </w:pPr>
+      <w:r>
+        <w:rPr>
+          <w:rFonts w:ascii="Consolas" w:hAnsi="Consolas"/>
+          <w:sz w:val="18"/>
+          <w:szCs w:val="18"/>
+          <w:color w:val="333333"/>
+        </w:rPr>
+        <w:t xml:space="preserve">        â”Œâ”€â”€â”€â”€â”€â”€â”€â”€â”€â”€â”€â”€â”¼â”€â”€â”€â”€â”€â”€â”€â”€â”€â”€â”€â”€â”</w:t>
       </w:r>
     </w:p>
     <w:p>
@@ -310,7 +310,7 @@
           <w:szCs w:val="18"/>
           <w:color w:val="333333"/>
         </w:rPr>
-        <w:t xml:space="preserve">                     │</w:t>
+        <w:t xml:space="preserve">                     â”‚</w:t>
       </w:r>
     </w:p>
     <w:p>
@@ -352,21 +352,21 @@
           <w:szCs w:val="18"/>
           <w:color w:val="333333"/>
         </w:rPr>
-        <w:t xml:space="preserve">                     │</w:t>
-      </w:r>
-    </w:p>
-    <w:p>
-      <w:pPr>
-        <w:spacing w:before="0" w:after="0"/>
-      </w:pPr>
-      <w:r>
-        <w:rPr>
-          <w:rFonts w:ascii="Consolas" w:hAnsi="Consolas"/>
-          <w:sz w:val="18"/>
-          <w:szCs w:val="18"/>
-          <w:color w:val="333333"/>
-        </w:rPr>
-        <w:t xml:space="preserve">     ┌───────────────┼──────────────────────────┐</w:t>
+        <w:t xml:space="preserve">                     â”‚</w:t>
+      </w:r>
+    </w:p>
+    <w:p>
+      <w:pPr>
+        <w:spacing w:before="0" w:after="0"/>
+      </w:pPr>
+      <w:r>
+        <w:rPr>
+          <w:rFonts w:ascii="Consolas" w:hAnsi="Consolas"/>
+          <w:sz w:val="18"/>
+          <w:szCs w:val="18"/>
+          <w:color w:val="333333"/>
+        </w:rPr>
+        <w:t xml:space="preserve">     â”Œâ”€â”€â”€â”€â”€â”€â”€â”€â”€â”€â”€â”€â”€â”€â”€â”¼â”€â”€â”€â”€â”€â”€â”€â”€â”€â”€â”€â”€â”€â”€â”€â”€â”€â”€â”€â”€â”€â”€â”€â”€â”€â”€â”</w:t>
       </w:r>
     </w:p>
     <w:p>
@@ -456,7 +456,7 @@
           <w:szCs w:val="30"/>
           <w:color w:val="1F3864"/>
         </w:rPr>
-        <w:t xml:space="preserve">2. engine/src/ — the engine (read these in this order)</w:t>
+        <w:t xml:space="preserve">2. engine/src/ â€” the engine (read these in this order)</w:t>
       </w:r>
     </w:p>
     <w:p>
@@ -475,7 +475,7 @@
           <w:szCs w:val="30"/>
           <w:color w:val="1F3864"/>
         </w:rPr>
-        <w:t xml:space="preserve">2.1 engine/src/taxonomy.js — the knowledge base (pure data)</w:t>
+        <w:t xml:space="preserve">2.1 engine/src/taxonomy.js â€” the knowledge base (pure data)</w:t>
       </w:r>
     </w:p>
     <w:p>
@@ -525,46 +525,46 @@
           <w:sz w:val="18"/>
           <w:szCs w:val="18"/>
         </w:rPr>
-        <w:t xml:space="preserve">REQUIREMENTS   |   30   |   the security controls we check (encryption, IAM, logging…)</w:t>
-      </w:r>
-    </w:p>
-    <w:p>
-      <w:pPr>
-        <w:spacing w:before="0" w:after="0"/>
-      </w:pPr>
-      <w:r>
-        <w:rPr>
-          <w:rFonts w:ascii="Consolas" w:hAnsi="Consolas"/>
-          <w:sz w:val="18"/>
-          <w:szCs w:val="18"/>
-        </w:rPr>
-        <w:t xml:space="preserve">RESOURCES   |   78   |   AWS services (S3, EC2, RDS…) and which controls each needs</w:t>
-      </w:r>
-    </w:p>
-    <w:p>
-      <w:pPr>
-        <w:spacing w:before="0" w:after="0"/>
-      </w:pPr>
-      <w:r>
-        <w:rPr>
-          <w:rFonts w:ascii="Consolas" w:hAnsi="Consolas"/>
-          <w:sz w:val="18"/>
-          <w:szCs w:val="18"/>
-        </w:rPr>
-        <w:t xml:space="preserve">RISKY_PATTERNS   |   9   |   dangerous phrasings (0.0.0.0/0, public bucket…)</w:t>
-      </w:r>
-    </w:p>
-    <w:p>
-      <w:pPr>
-        <w:spacing w:before="0" w:after="0"/>
-      </w:pPr>
-      <w:r>
-        <w:rPr>
-          <w:rFonts w:ascii="Consolas" w:hAnsi="Consolas"/>
-          <w:sz w:val="18"/>
-          <w:szCs w:val="18"/>
-        </w:rPr>
-        <w:t xml:space="preserve">SYNONYMS   |   19   |   everyday words → AWS words ("website" → EC2)</w:t>
+        <w:t xml:space="preserve">REQUIREMENTS   |   30   |   the security controls we check (encryption, IAM, loggingâ€¦)</w:t>
+      </w:r>
+    </w:p>
+    <w:p>
+      <w:pPr>
+        <w:spacing w:before="0" w:after="0"/>
+      </w:pPr>
+      <w:r>
+        <w:rPr>
+          <w:rFonts w:ascii="Consolas" w:hAnsi="Consolas"/>
+          <w:sz w:val="18"/>
+          <w:szCs w:val="18"/>
+        </w:rPr>
+        <w:t xml:space="preserve">RESOURCES   |   78   |   AWS services (S3, EC2, RDSâ€¦) and which controls each needs</w:t>
+      </w:r>
+    </w:p>
+    <w:p>
+      <w:pPr>
+        <w:spacing w:before="0" w:after="0"/>
+      </w:pPr>
+      <w:r>
+        <w:rPr>
+          <w:rFonts w:ascii="Consolas" w:hAnsi="Consolas"/>
+          <w:sz w:val="18"/>
+          <w:szCs w:val="18"/>
+        </w:rPr>
+        <w:t xml:space="preserve">RISKY_PATTERNS   |   9   |   dangerous phrasings (0.0.0.0/0, public bucketâ€¦)</w:t>
+      </w:r>
+    </w:p>
+    <w:p>
+      <w:pPr>
+        <w:spacing w:before="0" w:after="0"/>
+      </w:pPr>
+      <w:r>
+        <w:rPr>
+          <w:rFonts w:ascii="Consolas" w:hAnsi="Consolas"/>
+          <w:sz w:val="18"/>
+          <w:szCs w:val="18"/>
+        </w:rPr>
+        <w:t xml:space="preserve">SYNONYMS   |   19   |   everyday words â†’ AWS words ("website" â†’ EC2)</w:t>
       </w:r>
     </w:p>
     <w:p>
@@ -638,7 +638,7 @@
           <w:szCs w:val="30"/>
           <w:color w:val="1F3864"/>
         </w:rPr>
-        <w:t xml:space="preserve">2.2 engine/src/analyzer.js — the brain (the pipeline)</w:t>
+        <w:t xml:space="preserve">2.2 engine/src/analyzer.js â€” the brain (the pipeline)</w:t>
       </w:r>
     </w:p>
     <w:p>
@@ -701,7 +701,7 @@
           <w:sz w:val="22"/>
           <w:szCs w:val="22"/>
         </w:rPr>
-        <w:t xml:space="preserve">• Clean the text (lowercase, fix "unencrypted" → "not encrypted").</w:t>
+        <w:t xml:space="preserve">• Clean the text (lowercase, fix "unencrypted" â†’ "not encrypted").</w:t>
       </w:r>
     </w:p>
     <w:p>
@@ -714,7 +714,7 @@
           <w:sz w:val="22"/>
           <w:szCs w:val="22"/>
         </w:rPr>
-        <w:t xml:space="preserve">• Find the AWS resources mentioned → gives us the list of controls required.</w:t>
+        <w:t xml:space="preserve">• Find the AWS resources mentioned â†’ gives us the list of controls required.</w:t>
       </w:r>
     </w:p>
     <w:p>
@@ -740,7 +740,7 @@
           <w:sz w:val="22"/>
           <w:szCs w:val="22"/>
         </w:rPr>
-        <w:t xml:space="preserve">• Missing = required − stated. ← this is the whole product.</w:t>
+        <w:t xml:space="preserve">• Missing = required âˆ’ stated. â† this is the whole product.</w:t>
       </w:r>
     </w:p>
     <w:p>
@@ -796,7 +796,7 @@
           <w:sz w:val="22"/>
           <w:szCs w:val="22"/>
         </w:rPr>
-        <w:t xml:space="preserve">• harden(prompt) → rewrites the prompt until it scores risk 0 / coverage 100%.</w:t>
+        <w:t xml:space="preserve">• harden(prompt) â†’ rewrites the prompt until it scores risk 0 / coverage 100%.</w:t>
       </w:r>
     </w:p>
     <w:p>
@@ -809,7 +809,7 @@
           <w:sz w:val="22"/>
           <w:szCs w:val="22"/>
         </w:rPr>
-        <w:t xml:space="preserve">• project(report, accepted) → "what would the score be if I accept these?" (the live update).</w:t>
+        <w:t xml:space="preserve">• project(report, accepted) â†’ "what would the score be if I accept these?" (the live update).</w:t>
       </w:r>
     </w:p>
     <w:p>
@@ -857,7 +857,7 @@
           <w:szCs w:val="30"/>
           <w:color w:val="1F3864"/>
         </w:rPr>
-        <w:t xml:space="preserve">2.3 engine/src/semantic.js — word-similarity helper (small, optional)</w:t>
+        <w:t xml:space="preserve">2.3 engine/src/semantic.js â€” word-similarity helper (small, optional)</w:t>
       </w:r>
     </w:p>
     <w:p>
@@ -893,7 +893,7 @@
           <w:sz w:val="22"/>
           <w:szCs w:val="22"/>
         </w:rPr>
-        <w:t xml:space="preserve">Important honesty point: we measured it and found it is polarity-blind —</w:t>
+        <w:t xml:space="preserve">Important honesty point: we measured it and found it is polarity-blind â€”</w:t>
       </w:r>
     </w:p>
     <w:p>
@@ -960,7 +960,7 @@
           <w:szCs w:val="30"/>
           <w:color w:val="1F3864"/>
         </w:rPr>
-        <w:t xml:space="preserve">2.4 engine/src/llm.js — optional AI second opinion</w:t>
+        <w:t xml:space="preserve">2.4 engine/src/llm.js â€” optional AI second opinion</w:t>
       </w:r>
     </w:p>
     <w:p>
@@ -1020,7 +1020,7 @@
           <w:sz w:val="22"/>
           <w:szCs w:val="22"/>
         </w:rPr>
-        <w:t xml:space="preserve">contribution — the deterministic engine is."*</w:t>
+        <w:t xml:space="preserve">contribution â€” the deterministic engine is."*</w:t>
       </w:r>
     </w:p>
     <w:p>
@@ -1039,7 +1039,7 @@
           <w:szCs w:val="30"/>
           <w:color w:val="1F3864"/>
         </w:rPr>
-        <w:t xml:space="preserve">2.5 engine/src/tfcheck.js — checks generated Terraform</w:t>
+        <w:t xml:space="preserve">2.5 engine/src/tfcheck.js â€” checks generated Terraform</w:t>
       </w:r>
     </w:p>
     <w:p>
@@ -1063,19 +1063,19 @@
           <w:sz w:val="22"/>
           <w:szCs w:val="22"/>
         </w:rPr>
-        <w:t xml:space="preserve">encryption, 0.0.0.0/0…).</w:t>
-      </w:r>
-    </w:p>
-    <w:p>
-      <w:pPr>
-        <w:spacing w:before="0" w:after="100"/>
-      </w:pPr>
-      <w:r>
-        <w:rPr>
-          <w:sz w:val="22"/>
-          <w:szCs w:val="22"/>
-        </w:rPr>
-        <w:t xml:space="preserve">Why it exists: to show the honest pipeline — we check the prompt first, but</w:t>
+        <w:t xml:space="preserve">encryption, 0.0.0.0/0â€¦).</w:t>
+      </w:r>
+    </w:p>
+    <w:p>
+      <w:pPr>
+        <w:spacing w:before="0" w:after="100"/>
+      </w:pPr>
+      <w:r>
+        <w:rPr>
+          <w:sz w:val="22"/>
+          <w:szCs w:val="22"/>
+        </w:rPr>
+        <w:t xml:space="preserve">Why it exists: to show the honest pipeline â€” we check the prompt first, but</w:t>
       </w:r>
     </w:p>
     <w:p>
@@ -1106,7 +1106,7 @@
           <w:szCs w:val="30"/>
           <w:color w:val="1F3864"/>
         </w:rPr>
-        <w:t xml:space="preserve">2.6 engine/src/ui.js — draws the report (browser only)</w:t>
+        <w:t xml:space="preserve">2.6 engine/src/ui.js â€” draws the report (browser only)</w:t>
       </w:r>
     </w:p>
     <w:p>
@@ -1161,7 +1161,7 @@
           <w:szCs w:val="30"/>
           <w:color w:val="1F3864"/>
         </w:rPr>
-        <w:t xml:space="preserve">2.7 engine/src/settings.js — small shared helpers</w:t>
+        <w:t xml:space="preserve">2.7 engine/src/settings.js â€” small shared helpers</w:t>
       </w:r>
     </w:p>
     <w:p>
@@ -1354,20 +1354,20 @@
           <w:sz w:val="18"/>
           <w:szCs w:val="18"/>
         </w:rPr>
-        <w:t xml:space="preserve">engine/eval/   |   the evidence: labelled prompts, precision/recall harness, κ, downstream study</w:t>
-      </w:r>
-    </w:p>
-    <w:p>
-      <w:pPr>
-        <w:spacing w:before="0" w:after="0"/>
-      </w:pPr>
-      <w:r>
-        <w:rPr>
-          <w:rFonts w:ascii="Consolas" w:hAnsi="Consolas"/>
-          <w:sz w:val="18"/>
-          <w:szCs w:val="18"/>
-        </w:rPr>
-        <w:t xml:space="preserve">engine/test/   |   63 unit tests — run npm test</w:t>
+        <w:t xml:space="preserve">engine/eval/   |   the evidence: labelled prompts, precision/recall harness, Îº, downstream study</w:t>
+      </w:r>
+    </w:p>
+    <w:p>
+      <w:pPr>
+        <w:spacing w:before="0" w:after="0"/>
+      </w:pPr>
+      <w:r>
+        <w:rPr>
+          <w:rFonts w:ascii="Consolas" w:hAnsi="Consolas"/>
+          <w:sz w:val="18"/>
+          <w:szCs w:val="18"/>
+        </w:rPr>
+        <w:t xml:space="preserve">engine/test/   |   63 unit tests â€” run npm test</w:t>
       </w:r>
     </w:p>
     <w:p>
@@ -1580,7 +1580,7 @@
           <w:sz w:val="22"/>
           <w:szCs w:val="22"/>
         </w:rPr>
-        <w:t xml:space="preserve">• *"The knowledge lives in taxonomy.js — 78 AWS resources and 30 controls,</w:t>
+        <w:t xml:space="preserve">• *"The knowledge lives in taxonomy.js â€” 78 AWS resources and 30 controls,</w:t>
       </w:r>
     </w:p>
     <w:p>
@@ -1617,19 +1617,19 @@
           <w:sz w:val="22"/>
           <w:szCs w:val="22"/>
         </w:rPr>
-        <w:t xml:space="preserve">   controls they need, checks which ones the prompt already states — handling</w:t>
-      </w:r>
-    </w:p>
-    <w:p>
-      <w:pPr>
-        <w:spacing w:before="0" w:after="100"/>
-      </w:pPr>
-      <w:r>
-        <w:rPr>
-          <w:sz w:val="22"/>
-          <w:szCs w:val="22"/>
-        </w:rPr>
-        <w:t xml:space="preserve">   negation — and the difference is the missing set."*</w:t>
+        <w:t xml:space="preserve">   controls they need, checks which ones the prompt already states â€” handling</w:t>
+      </w:r>
+    </w:p>
+    <w:p>
+      <w:pPr>
+        <w:spacing w:before="0" w:after="100"/>
+      </w:pPr>
+      <w:r>
+        <w:rPr>
+          <w:sz w:val="22"/>
+          <w:szCs w:val="22"/>
+        </w:rPr>
+        <w:t xml:space="preserve">   negation â€” and the difference is the missing set."*</w:t>
       </w:r>
     </w:p>
     <w:p>
@@ -1680,7 +1680,7 @@
           <w:sz w:val="22"/>
           <w:szCs w:val="22"/>
         </w:rPr>
-        <w:t xml:space="preserve">• "The evidence is in engine/eval/ — 112 labelled prompts, and 63 unit tests."</w:t>
+        <w:t xml:space="preserve">• "The evidence is in engine/eval/ â€” 112 labelled prompts, and 63 unit tests."</w:t>
       </w:r>
     </w:p>
     <w:p>
@@ -1795,7 +1795,7 @@
           <w:sz w:val="18"/>
           <w:szCs w:val="18"/>
         </w:rPr>
-        <w:t xml:space="preserve">Why so many folders?   |   One engine, many clients — each surface is its own folder</w:t>
+        <w:t xml:space="preserve">Why so many folders?   |   One engine, many clients â€” each surface is its own folder</w:t>
       </w:r>
     </w:p>
     <w:p>

</xml_diff>